<commit_message>
feat: enhance Word template to A4 with centered signature, add canvas signature editor with zoom & boldness, and migrate all SVGs to Lucide icons
</commit_message>
<xml_diff>
--- a/resources/templates/Formulir_Pinjam_Pakai_Template.docx
+++ b/resources/templates/Formulir_Pinjam_Pakai_Template.docx
@@ -1516,7 +1516,7 @@
                             <w:rFonts w:ascii="Bookman Old Style" w:hAnsi="Bookman Old Style"/>
                             <w:sz w:val="18"/>
                           </w:rPr>
-                          <w:t>(${peminjam_kembali})</w:t>
+                          <w:t>${peminjam_kembali}</w:t>
                         </w:r>
                       </w:p>
                     </w:tc>
@@ -1537,7 +1537,7 @@
                             <w:rFonts w:ascii="Bookman Old Style" w:hAnsi="Bookman Old Style"/>
                             <w:sz w:val="18"/>
                           </w:rPr>
-                          <w:t>(${pj_kembali})</w:t>
+                          <w:t>${pj_kembali}</w:t>
                         </w:r>
                       </w:p>
                     </w:tc>
@@ -1650,7 +1650,7 @@
       </w:r>
     </w:p>
     <w:sectPr>
-      <w:pgSz w:w="12240" w:h="15840"/>
+      <w:pgSz w:w="11906" w:h="16838" w:code="9"/>
       <w:pgMar w:top="720" w:right="720" w:bottom="720" w:left="720" w:header="708" w:footer="708" w:gutter="0"/>
       <w:cols w:space="708"/>
       <w:docGrid w:linePitch="360"/>

</xml_diff>